<commit_message>
Report: point to the new repository URL
</commit_message>
<xml_diff>
--- a/report/emelyanov_sergey_exam_report_ru.docx
+++ b/report/emelyanov_sergey_exam_report_ru.docx
@@ -47,7 +47,7 @@
         <w:rPr>
           <w:sz w:val="18"/>
         </w:rPr>
-        <w:t>Репозиторий: https://github.com/Fighter90/sweettv-exam-recommender</w:t>
+        <w:t>Репозиторий: https://github.com/Fighter90/sweettv-recommender</w:t>
       </w:r>
     </w:p>
     <w:p>
@@ -1912,7 +1912,7 @@
       <w:r>
         <w:drawing>
           <wp:inline xmlns:a="http://schemas.openxmlformats.org/drawingml/2006/main" xmlns:pic="http://schemas.openxmlformats.org/drawingml/2006/picture">
-            <wp:extent cx="5220000" cy="2974186"/>
+            <wp:extent cx="5220000" cy="2978559"/>
             <wp:docPr id="2" name="Picture 2"/>
             <wp:cNvGraphicFramePr>
               <a:graphicFrameLocks noChangeAspect="1"/>
@@ -1933,7 +1933,7 @@
                   <pic:spPr>
                     <a:xfrm>
                       <a:off x="0" y="0"/>
-                      <a:ext cx="5220000" cy="2974186"/>
+                      <a:ext cx="5220000" cy="2978559"/>
                     </a:xfrm>
                     <a:prstGeom prst="rect"/>
                   </pic:spPr>

</xml_diff>